<commit_message>
Figma prototype and interface
</commit_message>
<xml_diff>
--- a/Design/User Login Interface Prototype.docx
+++ b/Design/User Login Interface Prototype.docx
@@ -30,7 +30,7 @@
           <w:rPr>
             <w:rStyle w:val="Hyperlink"/>
           </w:rPr>
-          <w:t>https://www.figma.com/make/iMT5jNDsBpYH7pJhQizVci/University-Clinic-Login-Screen?t=ml44WWpZcmkf69jt-1</w:t>
+          <w:t>https://clinic-booking-system--janamansour35.replit.app/</w:t>
         </w:r>
       </w:hyperlink>
     </w:p>
@@ -78,13 +78,19 @@
       </w:r>
       <w:r>
         <w:rPr>
+          <w:noProof/>
+        </w:rPr>
+        <w:t xml:space="preserve"> </w:t>
+      </w:r>
+      <w:r>
+        <w:rPr>
           <w:rFonts w:asciiTheme="majorBidi" w:hAnsiTheme="majorBidi" w:cstheme="majorBidi"/>
         </w:rPr>
         <w:drawing>
-          <wp:inline distT="0" distB="0" distL="0" distR="0" wp14:anchorId="43454125" wp14:editId="3B575796">
-            <wp:extent cx="5943600" cy="3099435"/>
-            <wp:effectExtent l="0" t="0" r="0" b="5715"/>
-            <wp:docPr id="765374184" name="Picture 1"/>
+          <wp:inline distT="0" distB="0" distL="0" distR="0" wp14:anchorId="6C145AA5" wp14:editId="5069CE64">
+            <wp:extent cx="5943600" cy="2955925"/>
+            <wp:effectExtent l="0" t="0" r="0" b="0"/>
+            <wp:docPr id="461670442" name="Picture 1"/>
             <wp:cNvGraphicFramePr>
               <a:graphicFrameLocks xmlns:a="http://schemas.openxmlformats.org/drawingml/2006/main" noChangeAspect="1"/>
             </wp:cNvGraphicFramePr>
@@ -92,7 +98,7 @@
               <a:graphicData uri="http://schemas.openxmlformats.org/drawingml/2006/picture">
                 <pic:pic xmlns:pic="http://schemas.openxmlformats.org/drawingml/2006/picture">
                   <pic:nvPicPr>
-                    <pic:cNvPr id="765374184" name=""/>
+                    <pic:cNvPr id="461670442" name=""/>
                     <pic:cNvPicPr/>
                   </pic:nvPicPr>
                   <pic:blipFill>
@@ -104,7 +110,7 @@
                   <pic:spPr>
                     <a:xfrm>
                       <a:off x="0" y="0"/>
-                      <a:ext cx="5943600" cy="3099435"/>
+                      <a:ext cx="5943600" cy="2955925"/>
                     </a:xfrm>
                     <a:prstGeom prst="rect">
                       <a:avLst/>
@@ -280,7 +286,6 @@
         <w:rPr>
           <w:rFonts w:asciiTheme="majorBidi" w:hAnsiTheme="majorBidi" w:cstheme="majorBidi"/>
         </w:rPr>
-        <w:lastRenderedPageBreak/>
         <w:t xml:space="preserve">The Information Side provides information to enable the user to understand the purpose of the system and build confidence about using the system prior to logging in. </w:t>
       </w:r>
     </w:p>
@@ -315,6 +320,7 @@
         <w:rPr>
           <w:rFonts w:asciiTheme="majorBidi" w:hAnsiTheme="majorBidi" w:cstheme="majorBidi"/>
         </w:rPr>
+        <w:lastRenderedPageBreak/>
         <w:t xml:space="preserve">- The Right side of the interface contains the login form where students enter their credentials, including: </w:t>
       </w:r>
     </w:p>
@@ -583,15 +589,7 @@
           <w:kern w:val="0"/>
           <w14:ligatures w14:val="none"/>
         </w:rPr>
-        <w:t xml:space="preserve">Placement of input fields that have been labelled </w:t>
-      </w:r>
-      <w:r>
-        <w:rPr>
-          <w:rFonts w:ascii="Times New Roman" w:eastAsia="Times New Roman" w:hAnsi="Times New Roman" w:cs="Times New Roman"/>
-          <w:kern w:val="0"/>
-          <w14:ligatures w14:val="none"/>
-        </w:rPr>
-        <w:t>clearly.</w:t>
+        <w:t>Placement of input fields that have been labelled clearly.</w:t>
       </w:r>
     </w:p>
     <w:p>
@@ -810,7 +808,6 @@
           <w:kern w:val="0"/>
           <w14:ligatures w14:val="none"/>
         </w:rPr>
-        <w:lastRenderedPageBreak/>
         <w:t xml:space="preserve">Passwords are hidden as they are being entered into the system. </w:t>
       </w:r>
     </w:p>
@@ -3105,6 +3102,7 @@
   <w:style w:type="character" w:default="1" w:styleId="DefaultParagraphFont">
     <w:name w:val="Default Paragraph Font"/>
     <w:uiPriority w:val="1"/>
+    <w:semiHidden/>
     <w:unhideWhenUsed/>
   </w:style>
   <w:style w:type="table" w:default="1" w:styleId="TableNormal">

</xml_diff>